<commit_message>
Add verified material from new worksheets
</commit_message>
<xml_diff>
--- a/deliverables/Lernheft_Pruefung_1_David_DE.docx
+++ b/deliverables/Lernheft_Pruefung_1_David_DE.docx
@@ -2368,6 +2368,11 @@
       </w:r>
     </w:p>
     <w:p>
+      <w:r>
+        <w:br w:type="page"/>
+      </w:r>
+    </w:p>
+    <w:p>
       <w:pPr>
         <w:pStyle w:val="Heading2"/>
       </w:pPr>
@@ -2708,6 +2713,271 @@
                 <w:sz w:val="19"/>
               </w:rPr>
               <w:t>Instrument für Gottesdienst und Gesang</w:t>
+            </w:r>
+          </w:p>
+        </w:tc>
+      </w:tr>
+    </w:tbl>
+    <w:p>
+      <w:pPr>
+        <w:spacing w:after="20"/>
+      </w:pPr>
+      <w:r>
+        <w:rPr>
+          <w:b w:val="0"/>
+          <w:i w:val="0"/>
+        </w:rPr>
+      </w:r>
+    </w:p>
+    <w:p>
+      <w:pPr>
+        <w:pStyle w:val="Heading2"/>
+      </w:pPr>
+      <w:r>
+        <w:t>Bibel und Sakramente</w:t>
+      </w:r>
+    </w:p>
+    <w:tbl>
+      <w:tblPr>
+        <w:tblStyle w:val="TableGrid"/>
+        <w:tblW w:type="auto" w:w="0"/>
+        <w:jc w:val="center"/>
+        <w:tblLayout w:type="fixed"/>
+        <w:tblLook w:firstColumn="1" w:firstRow="1" w:lastColumn="0" w:lastRow="0" w:noHBand="0" w:noVBand="1" w:val="04A0"/>
+      </w:tblPr>
+      <w:tblGrid>
+        <w:gridCol w:w="2736"/>
+        <w:gridCol w:w="6624"/>
+      </w:tblGrid>
+      <w:tr>
+        <w:trPr>
+          <w:tblHeader w:val="true"/>
+        </w:trPr>
+        <w:tc>
+          <w:tcPr>
+            <w:tcW w:type="dxa" w:w="4961"/>
+            <w:shd w:fill="E8EEF5"/>
+            <w:tcMar>
+              <w:top w:w="80" w:type="dxa"/>
+              <w:bottom w:w="80" w:type="dxa"/>
+              <w:start w:w="120" w:type="dxa"/>
+              <w:end w:w="120" w:type="dxa"/>
+            </w:tcMar>
+          </w:tcPr>
+          <w:p>
+            <w:r>
+              <w:rPr>
+                <w:b/>
+                <w:color w:val="0B4F4A"/>
+                <w:sz w:val="18"/>
+              </w:rPr>
+              <w:t>Prüfungsbegriff</w:t>
+            </w:r>
+          </w:p>
+        </w:tc>
+        <w:tc>
+          <w:tcPr>
+            <w:tcW w:type="dxa" w:w="4961"/>
+            <w:shd w:fill="E8EEF5"/>
+            <w:tcMar>
+              <w:top w:w="80" w:type="dxa"/>
+              <w:bottom w:w="80" w:type="dxa"/>
+              <w:start w:w="120" w:type="dxa"/>
+              <w:end w:w="120" w:type="dxa"/>
+            </w:tcMar>
+          </w:tcPr>
+          <w:p>
+            <w:r>
+              <w:rPr>
+                <w:b/>
+                <w:color w:val="0B4F4A"/>
+                <w:sz w:val="18"/>
+              </w:rPr>
+              <w:t>Präzise Lernantwort</w:t>
+            </w:r>
+          </w:p>
+        </w:tc>
+      </w:tr>
+      <w:tr>
+        <w:tc>
+          <w:tcPr>
+            <w:tcW w:type="dxa" w:w="2736"/>
+            <w:tcMar>
+              <w:top w:w="80" w:type="dxa"/>
+              <w:bottom w:w="80" w:type="dxa"/>
+              <w:start w:w="120" w:type="dxa"/>
+              <w:end w:w="120" w:type="dxa"/>
+            </w:tcMar>
+          </w:tcPr>
+          <w:p>
+            <w:pPr>
+              <w:spacing w:after="40" w:line="264" w:lineRule="auto"/>
+            </w:pPr>
+            <w:r>
+              <w:rPr>
+                <w:sz w:val="18"/>
+              </w:rPr>
+              <w:t>Bibel</w:t>
+            </w:r>
+          </w:p>
+        </w:tc>
+        <w:tc>
+          <w:tcPr>
+            <w:tcW w:type="dxa" w:w="6624"/>
+            <w:tcMar>
+              <w:top w:w="80" w:type="dxa"/>
+              <w:bottom w:w="80" w:type="dxa"/>
+              <w:start w:w="120" w:type="dxa"/>
+              <w:end w:w="120" w:type="dxa"/>
+            </w:tcMar>
+          </w:tcPr>
+          <w:p>
+            <w:pPr>
+              <w:spacing w:after="40" w:line="264" w:lineRule="auto"/>
+            </w:pPr>
+            <w:r>
+              <w:rPr>
+                <w:sz w:val="18"/>
+              </w:rPr>
+              <w:t>Erstes/Altes und Neues Testament; 66 Bücher ist die evangelische Zählung.</w:t>
+            </w:r>
+          </w:p>
+        </w:tc>
+      </w:tr>
+      <w:tr>
+        <w:tc>
+          <w:tcPr>
+            <w:tcW w:type="dxa" w:w="2736"/>
+            <w:tcMar>
+              <w:top w:w="80" w:type="dxa"/>
+              <w:bottom w:w="80" w:type="dxa"/>
+              <w:start w:w="120" w:type="dxa"/>
+              <w:end w:w="120" w:type="dxa"/>
+            </w:tcMar>
+          </w:tcPr>
+          <w:p>
+            <w:pPr>
+              <w:spacing w:after="40" w:line="264" w:lineRule="auto"/>
+            </w:pPr>
+            <w:r>
+              <w:rPr>
+                <w:sz w:val="18"/>
+              </w:rPr>
+              <w:t>Evangelium</w:t>
+            </w:r>
+          </w:p>
+        </w:tc>
+        <w:tc>
+          <w:tcPr>
+            <w:tcW w:type="dxa" w:w="6624"/>
+            <w:tcMar>
+              <w:top w:w="80" w:type="dxa"/>
+              <w:bottom w:w="80" w:type="dxa"/>
+              <w:start w:w="120" w:type="dxa"/>
+              <w:end w:w="120" w:type="dxa"/>
+            </w:tcMar>
+          </w:tcPr>
+          <w:p>
+            <w:pPr>
+              <w:spacing w:after="40" w:line="264" w:lineRule="auto"/>
+            </w:pPr>
+            <w:r>
+              <w:rPr>
+                <w:sz w:val="18"/>
+              </w:rPr>
+              <w:t>Frohe Botschaft; Matthäus, Markus, Lukas und Johannes.</w:t>
+            </w:r>
+          </w:p>
+        </w:tc>
+      </w:tr>
+      <w:tr>
+        <w:tc>
+          <w:tcPr>
+            <w:tcW w:type="dxa" w:w="2736"/>
+            <w:tcMar>
+              <w:top w:w="80" w:type="dxa"/>
+              <w:bottom w:w="80" w:type="dxa"/>
+              <w:start w:w="120" w:type="dxa"/>
+              <w:end w:w="120" w:type="dxa"/>
+            </w:tcMar>
+          </w:tcPr>
+          <w:p>
+            <w:pPr>
+              <w:spacing w:after="40" w:line="264" w:lineRule="auto"/>
+            </w:pPr>
+            <w:r>
+              <w:rPr>
+                <w:sz w:val="18"/>
+              </w:rPr>
+              <w:t>7 katholische Sakramente</w:t>
+            </w:r>
+          </w:p>
+        </w:tc>
+        <w:tc>
+          <w:tcPr>
+            <w:tcW w:type="dxa" w:w="6624"/>
+            <w:tcMar>
+              <w:top w:w="80" w:type="dxa"/>
+              <w:bottom w:w="80" w:type="dxa"/>
+              <w:start w:w="120" w:type="dxa"/>
+              <w:end w:w="120" w:type="dxa"/>
+            </w:tcMar>
+          </w:tcPr>
+          <w:p>
+            <w:pPr>
+              <w:spacing w:after="40" w:line="264" w:lineRule="auto"/>
+            </w:pPr>
+            <w:r>
+              <w:rPr>
+                <w:sz w:val="18"/>
+              </w:rPr>
+              <w:t>Taufe, Firmung, Eucharistie, Busse, Krankensalbung, Weihe und Ehe.</w:t>
+            </w:r>
+          </w:p>
+        </w:tc>
+      </w:tr>
+      <w:tr>
+        <w:tc>
+          <w:tcPr>
+            <w:tcW w:type="dxa" w:w="2736"/>
+            <w:tcMar>
+              <w:top w:w="80" w:type="dxa"/>
+              <w:bottom w:w="80" w:type="dxa"/>
+              <w:start w:w="120" w:type="dxa"/>
+              <w:end w:w="120" w:type="dxa"/>
+            </w:tcMar>
+          </w:tcPr>
+          <w:p>
+            <w:pPr>
+              <w:spacing w:after="40" w:line="264" w:lineRule="auto"/>
+            </w:pPr>
+            <w:r>
+              <w:rPr>
+                <w:sz w:val="18"/>
+              </w:rPr>
+              <w:t>2 evangelische Sakramente</w:t>
+            </w:r>
+          </w:p>
+        </w:tc>
+        <w:tc>
+          <w:tcPr>
+            <w:tcW w:type="dxa" w:w="6624"/>
+            <w:tcMar>
+              <w:top w:w="80" w:type="dxa"/>
+              <w:bottom w:w="80" w:type="dxa"/>
+              <w:start w:w="120" w:type="dxa"/>
+              <w:end w:w="120" w:type="dxa"/>
+            </w:tcMar>
+          </w:tcPr>
+          <w:p>
+            <w:pPr>
+              <w:spacing w:after="40" w:line="264" w:lineRule="auto"/>
+            </w:pPr>
+            <w:r>
+              <w:rPr>
+                <w:sz w:val="18"/>
+              </w:rPr>
+              <w:t>Taufe und Abendmahl; Konfirmation ist eine wichtige Feier.</w:t>
             </w:r>
           </w:p>
         </w:tc>
@@ -4202,6 +4472,23 @@
       </w:r>
     </w:p>
     <w:p>
+      <w:pPr>
+        <w:pStyle w:val="Heading2"/>
+      </w:pPr>
+      <w:r>
+        <w:t>Der Koran</w:t>
+      </w:r>
+    </w:p>
+    <w:p>
+      <w:r>
+        <w:rPr>
+          <w:b w:val="0"/>
+          <w:i w:val="0"/>
+        </w:rPr>
+        <w:t>Der Koran umfasst 114 Suren. Sein arabischer Wortlaut ist zentral; Übersetzungen helfen beim Verstehen. Die vorgeschriebenen Rezitationen des Ritualgebets sind arabisch, persönliche Bittgebete können aber auch in anderen Sprachen gesprochen werden.</w:t>
+      </w:r>
+    </w:p>
+    <w:p>
       <w:r>
         <w:br w:type="page"/>
       </w:r>
@@ -4603,7 +4890,7 @@
               <w:rPr>
                 <w:b/>
                 <w:color w:val="0B4F4A"/>
-                <w:sz w:val="19"/>
+                <w:sz w:val="18"/>
               </w:rPr>
               <w:t>Begriff</w:t>
             </w:r>
@@ -4625,7 +4912,7 @@
               <w:rPr>
                 <w:b/>
                 <w:color w:val="0B4F4A"/>
-                <w:sz w:val="19"/>
+                <w:sz w:val="18"/>
               </w:rPr>
               <w:t>Funktion</w:t>
             </w:r>
@@ -4649,7 +4936,7 @@
             </w:pPr>
             <w:r>
               <w:rPr>
-                <w:sz w:val="19"/>
+                <w:sz w:val="18"/>
               </w:rPr>
               <w:t>Toraschrein</w:t>
             </w:r>
@@ -4671,9 +4958,9 @@
             </w:pPr>
             <w:r>
               <w:rPr>
-                <w:sz w:val="19"/>
+                <w:sz w:val="18"/>
               </w:rPr>
-              <w:t>Aufbewahrungsort für Torarollen</w:t>
+              <w:t>Aufbewahrungsort für Torarollen; zur Seite Jerusalems ausgerichtet</w:t>
             </w:r>
           </w:p>
         </w:tc>
@@ -4695,7 +4982,7 @@
             </w:pPr>
             <w:r>
               <w:rPr>
-                <w:sz w:val="19"/>
+                <w:sz w:val="18"/>
               </w:rPr>
               <w:t>Bima</w:t>
             </w:r>
@@ -4717,9 +5004,9 @@
             </w:pPr>
             <w:r>
               <w:rPr>
-                <w:sz w:val="19"/>
+                <w:sz w:val="18"/>
               </w:rPr>
-              <w:t>erhöhtes Lesepult für die Toralesung</w:t>
+              <w:t>Ort oder Lesepult für die Toralesung</w:t>
             </w:r>
           </w:p>
         </w:tc>
@@ -4741,7 +5028,7 @@
             </w:pPr>
             <w:r>
               <w:rPr>
-                <w:sz w:val="19"/>
+                <w:sz w:val="18"/>
               </w:rPr>
               <w:t>Ewiges Licht</w:t>
             </w:r>
@@ -4763,7 +5050,7 @@
             </w:pPr>
             <w:r>
               <w:rPr>
-                <w:sz w:val="19"/>
+                <w:sz w:val="18"/>
               </w:rPr>
               <w:t>Licht nahe dem Toraschrein</w:t>
             </w:r>
@@ -4787,9 +5074,9 @@
             </w:pPr>
             <w:r>
               <w:rPr>
-                <w:sz w:val="19"/>
+                <w:sz w:val="18"/>
               </w:rPr>
-              <w:t>Torarolle</w:t>
+              <w:t>Mesusa</w:t>
             </w:r>
           </w:p>
         </w:tc>
@@ -4809,9 +5096,9 @@
             </w:pPr>
             <w:r>
               <w:rPr>
-                <w:sz w:val="19"/>
+                <w:sz w:val="18"/>
               </w:rPr>
-              <w:t>handgeschriebener Text der Tora</w:t>
+              <w:t>Hülse am Türpfosten mit Pergamenttext</w:t>
             </w:r>
           </w:p>
         </w:tc>
@@ -4833,9 +5120,9 @@
             </w:pPr>
             <w:r>
               <w:rPr>
-                <w:sz w:val="19"/>
+                <w:sz w:val="18"/>
               </w:rPr>
-              <w:t>Kippa</w:t>
+              <w:t>Siddur</w:t>
             </w:r>
           </w:p>
         </w:tc>
@@ -4855,9 +5142,55 @@
             </w:pPr>
             <w:r>
               <w:rPr>
-                <w:sz w:val="19"/>
+                <w:sz w:val="18"/>
               </w:rPr>
-              <w:t>Kopfbedeckung, die viele jüdische Männer und Jungen tragen</w:t>
+              <w:t>Gebetbuch</w:t>
+            </w:r>
+          </w:p>
+        </w:tc>
+      </w:tr>
+      <w:tr>
+        <w:tc>
+          <w:tcPr>
+            <w:tcW w:type="dxa" w:w="1944"/>
+            <w:tcMar>
+              <w:top w:w="80" w:type="dxa"/>
+              <w:bottom w:w="80" w:type="dxa"/>
+              <w:start w:w="120" w:type="dxa"/>
+              <w:end w:w="120" w:type="dxa"/>
+            </w:tcMar>
+          </w:tcPr>
+          <w:p>
+            <w:pPr>
+              <w:spacing w:after="40" w:line="264" w:lineRule="auto"/>
+            </w:pPr>
+            <w:r>
+              <w:rPr>
+                <w:sz w:val="18"/>
+              </w:rPr>
+              <w:t>Kantor</w:t>
+            </w:r>
+          </w:p>
+        </w:tc>
+        <w:tc>
+          <w:tcPr>
+            <w:tcW w:type="dxa" w:w="7416"/>
+            <w:tcMar>
+              <w:top w:w="80" w:type="dxa"/>
+              <w:bottom w:w="80" w:type="dxa"/>
+              <w:start w:w="120" w:type="dxa"/>
+              <w:end w:w="120" w:type="dxa"/>
+            </w:tcMar>
+          </w:tcPr>
+          <w:p>
+            <w:pPr>
+              <w:spacing w:after="40" w:line="264" w:lineRule="auto"/>
+            </w:pPr>
+            <w:r>
+              <w:rPr>
+                <w:sz w:val="18"/>
+              </w:rPr>
+              <w:t>leitet den liturgischen Gesang</w:t>
             </w:r>
           </w:p>
         </w:tc>
@@ -4872,6 +5205,46 @@
           <w:b w:val="0"/>
           <w:i w:val="0"/>
         </w:rPr>
+      </w:r>
+    </w:p>
+    <w:p>
+      <w:pPr>
+        <w:pStyle w:val="Heading2"/>
+      </w:pPr>
+      <w:r>
+        <w:t>Feste und Schrift</w:t>
+      </w:r>
+    </w:p>
+    <w:p>
+      <w:pPr>
+        <w:pStyle w:val="ListBullet"/>
+      </w:pPr>
+      <w:r>
+        <w:t>Rosch Haschana ist das jüdische Neujahrsfest.</w:t>
+      </w:r>
+    </w:p>
+    <w:p>
+      <w:pPr>
+        <w:pStyle w:val="ListBullet"/>
+      </w:pPr>
+      <w:r>
+        <w:t>Jom Kippur ist der Versöhnungstag: Umkehr, Vergebung und Versöhnung stehen im Mittelpunkt.</w:t>
+      </w:r>
+    </w:p>
+    <w:p>
+      <w:pPr>
+        <w:pStyle w:val="ListBullet"/>
+      </w:pPr>
+      <w:r>
+        <w:t>Hebräisch wird von rechts nach links gelesen; eine Torarolle wird von einem Sofer auf Pergament geschrieben.</w:t>
+      </w:r>
+    </w:p>
+    <w:p>
+      <w:pPr>
+        <w:pStyle w:val="ListBullet"/>
+      </w:pPr>
+      <w:r>
+        <w:t>Eine Chanukkia hat acht Festlichter und ein Dienerlicht, also neun Lichter.</w:t>
       </w:r>
     </w:p>
     <w:p>

</xml_diff>